<commit_message>
Add PDF manual (viewable inline on GitHub) + document Companion module installation steps
</commit_message>
<xml_diff>
--- a/Wing-Theatre-Controller-Manual.docx
+++ b/Wing-Theatre-Controller-Manual.docx
@@ -2872,7 +2872,168 @@
         <w:spacing w:after="100" w:before="220"/>
       </w:pPr>
       <w:r>
-        <w:t xml:space="preserve">Setup</w:t>
+        <w:t xml:space="preserve">Installing the module</w:t>
+      </w:r>
+    </w:p>
+    <w:p>
+      <w:pPr>
+        <w:spacing w:after="160"/>
+      </w:pPr>
+      <w:r>
+        <w:t xml:space="preserve">Companion loads third-party modules from a folder on disk — the module isn't installed through Companion's own interface, so this is a one-time manual setup per machine running Companion:</w:t>
+      </w:r>
+    </w:p>
+    <w:p>
+      <w:pPr>
+        <w:pStyle w:val="ListParagraph"/>
+        <w:numPr>
+          <w:ilvl w:val="0"/>
+          <w:numId w:val="1"/>
+        </w:numPr>
+        <w:spacing w:after="80"/>
+      </w:pPr>
+      <w:r>
+        <w:t xml:space="preserve">Download companion-module-wingtheatre.zip from the Releases page and extract it anywhere (e.g. a companion-modules folder)</w:t>
+      </w:r>
+    </w:p>
+    <w:p>
+      <w:pPr>
+        <w:pStyle w:val="ListParagraph"/>
+        <w:numPr>
+          <w:ilvl w:val="0"/>
+          <w:numId w:val="1"/>
+        </w:numPr>
+        <w:spacing w:after="80"/>
+      </w:pPr>
+      <w:r>
+        <w:t xml:space="preserve">Install the module's dependencies using Companion's own bundled Node.js — it doesn't need a separate Node/Yarn install:</w:t>
+      </w:r>
+    </w:p>
+    <w:p>
+      <w:pPr>
+        <w:pStyle w:val="ListParagraph"/>
+        <w:numPr>
+          <w:ilvl w:val="1"/>
+          <w:numId w:val="1"/>
+        </w:numPr>
+        <w:spacing w:after="80"/>
+      </w:pPr>
+      <w:r>
+        <w:t xml:space="preserve">Windows: double-click install-windows.bat inside the extracted folder — it finds Companion automatically and installs everything</w:t>
+      </w:r>
+    </w:p>
+    <w:p>
+      <w:pPr>
+        <w:pStyle w:val="ListParagraph"/>
+        <w:numPr>
+          <w:ilvl w:val="1"/>
+          <w:numId w:val="1"/>
+        </w:numPr>
+        <w:spacing w:after="80"/>
+      </w:pPr>
+      <w:r>
+        <w:t xml:space="preserve">macOS: open Terminal in the extracted folder and run the two commands below</w:t>
+      </w:r>
+    </w:p>
+    <w:p>
+      <w:pPr>
+        <w:spacing w:after="40"/>
+        <w:ind w:left="400"/>
+      </w:pPr>
+      <w:r>
+        <w:rPr>
+          <w:rFonts w:ascii="Consolas" w:cs="Consolas" w:eastAsia="Consolas" w:hAnsi="Consolas"/>
+          <w:color w:val="9B2C6F"/>
+          <w:sz w:val="20"/>
+          <w:szCs w:val="20"/>
+        </w:rPr>
+        <w:t xml:space="preserve">/Applications/Companion.app/Contents/Resources/node-runtimes/node22/bin/node \</w:t>
+      </w:r>
+    </w:p>
+    <w:p>
+      <w:pPr>
+        <w:spacing w:after="40"/>
+        <w:ind w:left="400"/>
+      </w:pPr>
+      <w:r>
+        <w:rPr>
+          <w:rFonts w:ascii="Consolas" w:cs="Consolas" w:eastAsia="Consolas" w:hAnsi="Consolas"/>
+          <w:color w:val="9B2C6F"/>
+          <w:sz w:val="20"/>
+          <w:szCs w:val="20"/>
+        </w:rPr>
+        <w:t xml:space="preserve">  /Applications/Companion.app/Contents/Resources/node-runtimes/node22/lib/node_modules/corepack/dist/corepack.js \</w:t>
+      </w:r>
+    </w:p>
+    <w:p>
+      <w:pPr>
+        <w:spacing w:after="160"/>
+        <w:ind w:left="400"/>
+      </w:pPr>
+      <w:r>
+        <w:rPr>
+          <w:rFonts w:ascii="Consolas" w:cs="Consolas" w:eastAsia="Consolas" w:hAnsi="Consolas"/>
+          <w:color w:val="9B2C6F"/>
+          <w:sz w:val="20"/>
+          <w:szCs w:val="20"/>
+        </w:rPr>
+        <w:t xml:space="preserve">  yarn install</w:t>
+      </w:r>
+    </w:p>
+    <w:p>
+      <w:pPr>
+        <w:pStyle w:val="ListParagraph"/>
+        <w:numPr>
+          <w:ilvl w:val="0"/>
+          <w:numId w:val="1"/>
+        </w:numPr>
+        <w:spacing w:after="80"/>
+      </w:pPr>
+      <w:r>
+        <w:t xml:space="preserve">Open Companion Launcher (not the browser UI) → the gear/cog icon → Advanced Settings</w:t>
+      </w:r>
+    </w:p>
+    <w:p>
+      <w:pPr>
+        <w:pStyle w:val="ListParagraph"/>
+        <w:numPr>
+          <w:ilvl w:val="0"/>
+          <w:numId w:val="1"/>
+        </w:numPr>
+        <w:spacing w:after="80"/>
+      </w:pPr>
+      <w:r>
+        <w:t xml:space="preserve">Under Developer, click Select and choose the PARENT folder that contains the extracted module folder (not the module folder itself)</w:t>
+      </w:r>
+    </w:p>
+    <w:p>
+      <w:pPr>
+        <w:pStyle w:val="ListParagraph"/>
+        <w:numPr>
+          <w:ilvl w:val="0"/>
+          <w:numId w:val="1"/>
+        </w:numPr>
+        <w:spacing w:after="80"/>
+      </w:pPr>
+      <w:r>
+        <w:t xml:space="preserve">Enable Developer Modules, then click Launch GUI</w:t>
+      </w:r>
+    </w:p>
+    <w:p>
+      <w:pPr>
+        <w:spacing w:after="160"/>
+      </w:pPr>
+      <w:r>
+        <w:t xml:space="preserve">The module now appears as an available connection type in Companion, and stays available across restarts — this only needs doing once per machine, and again after installing a newer version of the module.</w:t>
+      </w:r>
+    </w:p>
+    <w:p>
+      <w:pPr>
+        <w:pStyle w:val="Heading3"/>
+        <w:spacing w:after="100" w:before="220"/>
+      </w:pPr>
+      <w:r>
+        <w:t xml:space="preserve">Adding the connection</w:t>
       </w:r>
     </w:p>
     <w:p>

</xml_diff>